<commit_message>
fix some buggy issues v2.2.3
</commit_message>
<xml_diff>
--- a/public/GraduationApplicationFormTemplate.docx
+++ b/public/GraduationApplicationFormTemplate.docx
@@ -508,7 +508,23 @@
                 <w:bCs/>
                 <w:lang w:val="en-PH"/>
               </w:rPr>
-              <w:t>${application_created_at}</w:t>
+              <w:t>${</w:t>
+            </w:r>
+            <w:proofErr w:type="spellStart"/>
+            <w:r>
+              <w:rPr>
+                <w:bCs/>
+                <w:lang w:val="en-PH"/>
+              </w:rPr>
+              <w:t>application_created_at</w:t>
+            </w:r>
+            <w:proofErr w:type="spellEnd"/>
+            <w:r>
+              <w:rPr>
+                <w:bCs/>
+                <w:lang w:val="en-PH"/>
+              </w:rPr>
+              <w:t>}</w:t>
             </w:r>
           </w:p>
         </w:tc>
@@ -652,7 +668,27 @@
                 <w:szCs w:val="24"/>
                 <w:lang w:val="en-PH"/>
               </w:rPr>
-              <w:t>${graduation_appearance}</w:t>
+              <w:t>${</w:t>
+            </w:r>
+            <w:proofErr w:type="spellStart"/>
+            <w:r>
+              <w:rPr>
+                <w:bCs/>
+                <w:sz w:val="24"/>
+                <w:szCs w:val="24"/>
+                <w:lang w:val="en-PH"/>
+              </w:rPr>
+              <w:t>graduation_appearance</w:t>
+            </w:r>
+            <w:proofErr w:type="spellEnd"/>
+            <w:r>
+              <w:rPr>
+                <w:bCs/>
+                <w:sz w:val="24"/>
+                <w:szCs w:val="24"/>
+                <w:lang w:val="en-PH"/>
+              </w:rPr>
+              <w:t>}</w:t>
             </w:r>
           </w:p>
         </w:tc>
@@ -843,7 +879,21 @@
               <w:rPr>
                 <w:lang w:val="en-PH"/>
               </w:rPr>
-              <w:t>${student_last_name}</w:t>
+              <w:t>${</w:t>
+            </w:r>
+            <w:proofErr w:type="spellStart"/>
+            <w:r>
+              <w:rPr>
+                <w:lang w:val="en-PH"/>
+              </w:rPr>
+              <w:t>student_last_name</w:t>
+            </w:r>
+            <w:proofErr w:type="spellEnd"/>
+            <w:r>
+              <w:rPr>
+                <w:lang w:val="en-PH"/>
+              </w:rPr>
+              <w:t>}</w:t>
             </w:r>
           </w:p>
         </w:tc>
@@ -892,7 +942,21 @@
               <w:rPr>
                 <w:lang w:val="en-PH"/>
               </w:rPr>
-              <w:t>${student_first_name}</w:t>
+              <w:t>${</w:t>
+            </w:r>
+            <w:proofErr w:type="spellStart"/>
+            <w:r>
+              <w:rPr>
+                <w:lang w:val="en-PH"/>
+              </w:rPr>
+              <w:t>student_first_name</w:t>
+            </w:r>
+            <w:proofErr w:type="spellEnd"/>
+            <w:r>
+              <w:rPr>
+                <w:lang w:val="en-PH"/>
+              </w:rPr>
+              <w:t>}</w:t>
             </w:r>
           </w:p>
         </w:tc>
@@ -939,7 +1003,21 @@
               <w:rPr>
                 <w:lang w:val="en-PH"/>
               </w:rPr>
-              <w:t>${student_middle_name}</w:t>
+              <w:t>${</w:t>
+            </w:r>
+            <w:proofErr w:type="spellStart"/>
+            <w:r>
+              <w:rPr>
+                <w:lang w:val="en-PH"/>
+              </w:rPr>
+              <w:t>student_middle_name</w:t>
+            </w:r>
+            <w:proofErr w:type="spellEnd"/>
+            <w:r>
+              <w:rPr>
+                <w:lang w:val="en-PH"/>
+              </w:rPr>
+              <w:t>}</w:t>
             </w:r>
           </w:p>
         </w:tc>
@@ -1171,8 +1249,16 @@
               <w:rPr>
                 <w:lang w:val="en-PH"/>
               </w:rPr>
-              <w:t>${course_name</w:t>
-            </w:r>
+              <w:t>${</w:t>
+            </w:r>
+            <w:proofErr w:type="spellStart"/>
+            <w:r>
+              <w:rPr>
+                <w:lang w:val="en-PH"/>
+              </w:rPr>
+              <w:t>course_name</w:t>
+            </w:r>
+            <w:proofErr w:type="spellEnd"/>
             <w:r>
               <w:rPr>
                 <w:lang w:val="en-PH"/>
@@ -1226,7 +1312,21 @@
               <w:rPr>
                 <w:lang w:val="en-PH"/>
               </w:rPr>
-              <w:t>${major_name}</w:t>
+              <w:t>${</w:t>
+            </w:r>
+            <w:proofErr w:type="spellStart"/>
+            <w:r>
+              <w:rPr>
+                <w:lang w:val="en-PH"/>
+              </w:rPr>
+              <w:t>major_name</w:t>
+            </w:r>
+            <w:proofErr w:type="spellEnd"/>
+            <w:r>
+              <w:rPr>
+                <w:lang w:val="en-PH"/>
+              </w:rPr>
+              <w:t>}</w:t>
             </w:r>
           </w:p>
         </w:tc>
@@ -1413,7 +1513,21 @@
               <w:rPr>
                 <w:lang w:val="en-PH"/>
               </w:rPr>
-              <w:t>${permanent_address}</w:t>
+              <w:t>${</w:t>
+            </w:r>
+            <w:proofErr w:type="spellStart"/>
+            <w:r>
+              <w:rPr>
+                <w:lang w:val="en-PH"/>
+              </w:rPr>
+              <w:t>permanent_address</w:t>
+            </w:r>
+            <w:proofErr w:type="spellEnd"/>
+            <w:r>
+              <w:rPr>
+                <w:lang w:val="en-PH"/>
+              </w:rPr>
+              <w:t>}</w:t>
             </w:r>
           </w:p>
         </w:tc>
@@ -1483,7 +1597,21 @@
               <w:rPr>
                 <w:lang w:val="en-PH"/>
               </w:rPr>
-              <w:t>${date_of_birth}</w:t>
+              <w:t>${</w:t>
+            </w:r>
+            <w:proofErr w:type="spellStart"/>
+            <w:r>
+              <w:rPr>
+                <w:lang w:val="en-PH"/>
+              </w:rPr>
+              <w:t>date_of_birth</w:t>
+            </w:r>
+            <w:proofErr w:type="spellEnd"/>
+            <w:r>
+              <w:rPr>
+                <w:lang w:val="en-PH"/>
+              </w:rPr>
+              <w:t>}</w:t>
             </w:r>
           </w:p>
         </w:tc>
@@ -1554,7 +1682,21 @@
               <w:rPr>
                 <w:lang w:val="en-PH"/>
               </w:rPr>
-              <w:t>${place_of_birth}</w:t>
+              <w:t>${</w:t>
+            </w:r>
+            <w:proofErr w:type="spellStart"/>
+            <w:r>
+              <w:rPr>
+                <w:lang w:val="en-PH"/>
+              </w:rPr>
+              <w:t>place_of_birth</w:t>
+            </w:r>
+            <w:proofErr w:type="spellEnd"/>
+            <w:r>
+              <w:rPr>
+                <w:lang w:val="en-PH"/>
+              </w:rPr>
+              <w:t>}</w:t>
             </w:r>
           </w:p>
         </w:tc>
@@ -1692,7 +1834,21 @@
               <w:rPr>
                 <w:lang w:val="en-PH"/>
               </w:rPr>
-              <w:t>${civil_status}</w:t>
+              <w:t>${</w:t>
+            </w:r>
+            <w:proofErr w:type="spellStart"/>
+            <w:r>
+              <w:rPr>
+                <w:lang w:val="en-PH"/>
+              </w:rPr>
+              <w:t>civil_status</w:t>
+            </w:r>
+            <w:proofErr w:type="spellEnd"/>
+            <w:r>
+              <w:rPr>
+                <w:lang w:val="en-PH"/>
+              </w:rPr>
+              <w:t>}</w:t>
             </w:r>
           </w:p>
         </w:tc>
@@ -1900,7 +2056,21 @@
               <w:rPr>
                 <w:lang w:val="en-PH"/>
               </w:rPr>
-              <w:t>${contact_number}</w:t>
+              <w:t>${</w:t>
+            </w:r>
+            <w:proofErr w:type="spellStart"/>
+            <w:r>
+              <w:rPr>
+                <w:lang w:val="en-PH"/>
+              </w:rPr>
+              <w:t>contact_number</w:t>
+            </w:r>
+            <w:proofErr w:type="spellEnd"/>
+            <w:r>
+              <w:rPr>
+                <w:lang w:val="en-PH"/>
+              </w:rPr>
+              <w:t>}</w:t>
             </w:r>
           </w:p>
         </w:tc>
@@ -1968,7 +2138,21 @@
               <w:rPr>
                 <w:lang w:val="en-PH"/>
               </w:rPr>
-              <w:t>${student_email}</w:t>
+              <w:t>${</w:t>
+            </w:r>
+            <w:proofErr w:type="spellStart"/>
+            <w:r>
+              <w:rPr>
+                <w:lang w:val="en-PH"/>
+              </w:rPr>
+              <w:t>student_email</w:t>
+            </w:r>
+            <w:proofErr w:type="spellEnd"/>
+            <w:r>
+              <w:rPr>
+                <w:lang w:val="en-PH"/>
+              </w:rPr>
+              <w:t>}</w:t>
             </w:r>
           </w:p>
         </w:tc>
@@ -4180,7 +4364,27 @@
                 <w:szCs w:val="18"/>
                 <w:lang w:val="en-PH"/>
               </w:rPr>
-              <w:t>${college_school_name}</w:t>
+              <w:t>${</w:t>
+            </w:r>
+            <w:proofErr w:type="spellStart"/>
+            <w:r>
+              <w:rPr>
+                <w:bCs/>
+                <w:sz w:val="18"/>
+                <w:szCs w:val="18"/>
+                <w:lang w:val="en-PH"/>
+              </w:rPr>
+              <w:t>college_school_name</w:t>
+            </w:r>
+            <w:proofErr w:type="spellEnd"/>
+            <w:r>
+              <w:rPr>
+                <w:bCs/>
+                <w:sz w:val="18"/>
+                <w:szCs w:val="18"/>
+                <w:lang w:val="en-PH"/>
+              </w:rPr>
+              <w:t>}</w:t>
             </w:r>
           </w:p>
         </w:tc>
@@ -4223,7 +4427,27 @@
                 <w:szCs w:val="18"/>
                 <w:lang w:val="en-PH"/>
               </w:rPr>
-              <w:t>${college_year_graduated}</w:t>
+              <w:t>${</w:t>
+            </w:r>
+            <w:proofErr w:type="spellStart"/>
+            <w:r>
+              <w:rPr>
+                <w:bCs/>
+                <w:sz w:val="18"/>
+                <w:szCs w:val="18"/>
+                <w:lang w:val="en-PH"/>
+              </w:rPr>
+              <w:t>college_year_graduated</w:t>
+            </w:r>
+            <w:proofErr w:type="spellEnd"/>
+            <w:r>
+              <w:rPr>
+                <w:bCs/>
+                <w:sz w:val="18"/>
+                <w:szCs w:val="18"/>
+                <w:lang w:val="en-PH"/>
+              </w:rPr>
+              <w:t>}</w:t>
             </w:r>
           </w:p>
         </w:tc>
@@ -4476,7 +4700,27 @@
                 <w:szCs w:val="18"/>
                 <w:lang w:val="en-PH"/>
               </w:rPr>
-              <w:t>${masters_school}</w:t>
+              <w:t>${</w:t>
+            </w:r>
+            <w:proofErr w:type="spellStart"/>
+            <w:r>
+              <w:rPr>
+                <w:bCs/>
+                <w:sz w:val="18"/>
+                <w:szCs w:val="18"/>
+                <w:lang w:val="en-PH"/>
+              </w:rPr>
+              <w:t>masters_school</w:t>
+            </w:r>
+            <w:proofErr w:type="spellEnd"/>
+            <w:r>
+              <w:rPr>
+                <w:bCs/>
+                <w:sz w:val="18"/>
+                <w:szCs w:val="18"/>
+                <w:lang w:val="en-PH"/>
+              </w:rPr>
+              <w:t>}</w:t>
             </w:r>
           </w:p>
         </w:tc>
@@ -4519,7 +4763,27 @@
                 <w:szCs w:val="18"/>
                 <w:lang w:val="en-PH"/>
               </w:rPr>
-              <w:t>${masters_year}</w:t>
+              <w:t>${</w:t>
+            </w:r>
+            <w:proofErr w:type="spellStart"/>
+            <w:r>
+              <w:rPr>
+                <w:bCs/>
+                <w:sz w:val="18"/>
+                <w:szCs w:val="18"/>
+                <w:lang w:val="en-PH"/>
+              </w:rPr>
+              <w:t>masters_year</w:t>
+            </w:r>
+            <w:proofErr w:type="spellEnd"/>
+            <w:r>
+              <w:rPr>
+                <w:bCs/>
+                <w:sz w:val="18"/>
+                <w:szCs w:val="18"/>
+                <w:lang w:val="en-PH"/>
+              </w:rPr>
+              <w:t>}</w:t>
             </w:r>
           </w:p>
         </w:tc>
@@ -4589,7 +4853,27 @@
                 <w:szCs w:val="18"/>
                 <w:lang w:val="en-PH"/>
               </w:rPr>
-              <w:t>${doctoral_school}</w:t>
+              <w:t>${</w:t>
+            </w:r>
+            <w:proofErr w:type="spellStart"/>
+            <w:r>
+              <w:rPr>
+                <w:bCs/>
+                <w:sz w:val="18"/>
+                <w:szCs w:val="18"/>
+                <w:lang w:val="en-PH"/>
+              </w:rPr>
+              <w:t>doctoral_school</w:t>
+            </w:r>
+            <w:proofErr w:type="spellEnd"/>
+            <w:r>
+              <w:rPr>
+                <w:bCs/>
+                <w:sz w:val="18"/>
+                <w:szCs w:val="18"/>
+                <w:lang w:val="en-PH"/>
+              </w:rPr>
+              <w:t>}</w:t>
             </w:r>
           </w:p>
         </w:tc>
@@ -4633,7 +4917,27 @@
                 <w:szCs w:val="18"/>
                 <w:lang w:val="en-PH"/>
               </w:rPr>
-              <w:t>${doctoral_year}</w:t>
+              <w:t>${</w:t>
+            </w:r>
+            <w:proofErr w:type="spellStart"/>
+            <w:r>
+              <w:rPr>
+                <w:bCs/>
+                <w:sz w:val="18"/>
+                <w:szCs w:val="18"/>
+                <w:lang w:val="en-PH"/>
+              </w:rPr>
+              <w:t>doctoral_year</w:t>
+            </w:r>
+            <w:proofErr w:type="spellEnd"/>
+            <w:r>
+              <w:rPr>
+                <w:bCs/>
+                <w:sz w:val="18"/>
+                <w:szCs w:val="18"/>
+                <w:lang w:val="en-PH"/>
+              </w:rPr>
+              <w:t>}</w:t>
             </w:r>
           </w:p>
         </w:tc>
@@ -4786,7 +5090,7 @@
           </mc:Choice>
           <mc:Fallback>
             <w:pict>
-              <v:shape w14:anchorId="20C5A7BB" id="Graphic 47" o:spid="_x0000_s1026" style="position:absolute;margin-left:308.7pt;margin-top:17.55pt;width:.5pt;height:39.7pt;z-index:-251600896;visibility:visible;mso-wrap-style:square;mso-height-percent:0;mso-wrap-distance-left:0;mso-wrap-distance-top:0;mso-wrap-distance-right:0;mso-wrap-distance-bottom:0;mso-position-horizontal:absolute;mso-position-horizontal-relative:page;mso-position-vertical:absolute;mso-position-vertical-relative:text;mso-height-percent:0;mso-height-relative:margin;v-text-anchor:top" coordsize="6350,586740" o:gfxdata="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" path="m6083,440448r-6083,l,586740r6083,l6083,440448xem6083,288048r-6083,l,434340r,6096l6083,440436r,-6096l6083,288048xem6083,l,,,137160,,281940r,6096l6083,288036r,-6096l6083,137160,6083,xe" fillcolor="black" stroked="f">
+              <v:shape w14:anchorId="181CB938" id="Graphic 47" o:spid="_x0000_s1026" style="position:absolute;margin-left:308.7pt;margin-top:17.55pt;width:.5pt;height:39.7pt;z-index:-251600896;visibility:visible;mso-wrap-style:square;mso-height-percent:0;mso-wrap-distance-left:0;mso-wrap-distance-top:0;mso-wrap-distance-right:0;mso-wrap-distance-bottom:0;mso-position-horizontal:absolute;mso-position-horizontal-relative:page;mso-position-vertical:absolute;mso-position-vertical-relative:text;mso-height-percent:0;mso-height-relative:margin;v-text-anchor:top" coordsize="6350,586740" o:gfxdata="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" path="m6083,440448r-6083,l,586740r6083,l6083,440448xem6083,288048r-6083,l,434340r,6096l6083,440436r,-6096l6083,288048xem6083,l,,,137160,,281940r,6096l6083,288036r,-6096l6083,137160,6083,xe" fillcolor="black" stroked="f">
                 <v:path arrowok="t"/>
                 <w10:wrap anchorx="page"/>
               </v:shape>
@@ -5632,7 +5936,29 @@
                 <w:szCs w:val="16"/>
                 <w:lang w:val="en-PH"/>
               </w:rPr>
-              <w:t>${thesis_title}</w:t>
+              <w:t>${</w:t>
+            </w:r>
+            <w:proofErr w:type="spellStart"/>
+            <w:r>
+              <w:rPr>
+                <w:b/>
+                <w:bCs/>
+                <w:sz w:val="16"/>
+                <w:szCs w:val="16"/>
+                <w:lang w:val="en-PH"/>
+              </w:rPr>
+              <w:t>thesis_title</w:t>
+            </w:r>
+            <w:proofErr w:type="spellEnd"/>
+            <w:r>
+              <w:rPr>
+                <w:b/>
+                <w:bCs/>
+                <w:sz w:val="16"/>
+                <w:szCs w:val="16"/>
+                <w:lang w:val="en-PH"/>
+              </w:rPr>
+              <w:t>}</w:t>
             </w:r>
           </w:p>
         </w:tc>
@@ -5695,7 +6021,29 @@
                 <w:szCs w:val="16"/>
                 <w:lang w:val="en-PH"/>
               </w:rPr>
-              <w:t>${thesis_adviser}</w:t>
+              <w:t>${</w:t>
+            </w:r>
+            <w:proofErr w:type="spellStart"/>
+            <w:r>
+              <w:rPr>
+                <w:b/>
+                <w:bCs/>
+                <w:sz w:val="16"/>
+                <w:szCs w:val="16"/>
+                <w:lang w:val="en-PH"/>
+              </w:rPr>
+              <w:t>thesis_adviser</w:t>
+            </w:r>
+            <w:proofErr w:type="spellEnd"/>
+            <w:r>
+              <w:rPr>
+                <w:b/>
+                <w:bCs/>
+                <w:sz w:val="16"/>
+                <w:szCs w:val="16"/>
+                <w:lang w:val="en-PH"/>
+              </w:rPr>
+              <w:t>}</w:t>
             </w:r>
           </w:p>
         </w:tc>
@@ -5772,7 +6120,25 @@
                 <w:szCs w:val="24"/>
                 <w:lang w:val="en-PH"/>
               </w:rPr>
-              <w:t>${student_full_name}</w:t>
+              <w:t>${</w:t>
+            </w:r>
+            <w:proofErr w:type="spellStart"/>
+            <w:r>
+              <w:rPr>
+                <w:sz w:val="24"/>
+                <w:szCs w:val="24"/>
+                <w:lang w:val="en-PH"/>
+              </w:rPr>
+              <w:t>student_full_name</w:t>
+            </w:r>
+            <w:proofErr w:type="spellEnd"/>
+            <w:r>
+              <w:rPr>
+                <w:sz w:val="24"/>
+                <w:szCs w:val="24"/>
+                <w:lang w:val="en-PH"/>
+              </w:rPr>
+              <w:t>}</w:t>
             </w:r>
           </w:p>
         </w:tc>
@@ -6997,13 +7363,21 @@
               <w:rPr>
                 <w:lang w:val="en-PH"/>
               </w:rPr>
-              <w:t>(SGD)</w:t>
-            </w:r>
-            <w:r>
-              <w:rPr>
-                <w:lang w:val="en-PH"/>
-              </w:rPr>
-              <w:t>${coordinator_name}</w:t>
+              <w:t>${</w:t>
+            </w:r>
+            <w:proofErr w:type="spellStart"/>
+            <w:r>
+              <w:rPr>
+                <w:lang w:val="en-PH"/>
+              </w:rPr>
+              <w:t>coordinator_name</w:t>
+            </w:r>
+            <w:proofErr w:type="spellEnd"/>
+            <w:r>
+              <w:rPr>
+                <w:lang w:val="en-PH"/>
+              </w:rPr>
+              <w:t>}</w:t>
             </w:r>
           </w:p>
         </w:tc>
@@ -7141,7 +7515,21 @@
               <w:rPr>
                 <w:lang w:val="en-PH"/>
               </w:rPr>
-              <w:t>${approval_datetime}</w:t>
+              <w:t>${</w:t>
+            </w:r>
+            <w:proofErr w:type="spellStart"/>
+            <w:r>
+              <w:rPr>
+                <w:lang w:val="en-PH"/>
+              </w:rPr>
+              <w:t>approval_datetime</w:t>
+            </w:r>
+            <w:proofErr w:type="spellEnd"/>
+            <w:r>
+              <w:rPr>
+                <w:lang w:val="en-PH"/>
+              </w:rPr>
+              <w:t>}</w:t>
             </w:r>
           </w:p>
         </w:tc>
@@ -7851,7 +8239,25 @@
                 <w:szCs w:val="24"/>
                 <w:lang w:val="en-PH"/>
               </w:rPr>
-              <w:t>${application_status}</w:t>
+              <w:t>${</w:t>
+            </w:r>
+            <w:proofErr w:type="spellStart"/>
+            <w:r>
+              <w:rPr>
+                <w:sz w:val="20"/>
+                <w:szCs w:val="24"/>
+                <w:lang w:val="en-PH"/>
+              </w:rPr>
+              <w:t>application_status</w:t>
+            </w:r>
+            <w:proofErr w:type="spellEnd"/>
+            <w:r>
+              <w:rPr>
+                <w:sz w:val="20"/>
+                <w:szCs w:val="24"/>
+                <w:lang w:val="en-PH"/>
+              </w:rPr>
+              <w:t>}</w:t>
             </w:r>
           </w:p>
         </w:tc>

</xml_diff>